<commit_message>
Refactor SOP scripts and documentation for improved path handling and clarity
- Updated file paths in `_docx_to_pdf_word_v7.py` and `build_docx_from_template.py` to use relative paths based on the script's location.
- Enhanced documentation in various SOP markdown files to clarify execution processes, input/output details, and script locations.
- Improved consistency in references to SharePoint locations for scripts and SOPs across documentation.
- Streamlined execution instructions for batch processes and Python scripts to ensure clarity for users.

Made-with: Cursor
</commit_message>
<xml_diff>
--- a/documentation/SOP/DOCX_v11/SOP_IW_Batch_Reporting_Pipeline.docx
+++ b/documentation/SOP/DOCX_v11/SOP_IW_Batch_Reporting_Pipeline.docx
@@ -17,7 +17,7 @@
         <mc:AlternateContent>
           <mc:Choice Requires="wps">
             <w:drawing>
-              <wp:anchor distT="0" distB="0" distL="114300" distR="114300" simplePos="0" relativeHeight="251662337" behindDoc="0" locked="0" layoutInCell="1" allowOverlap="1" wp14:anchorId="7504AC04" wp14:editId="4F480386">
+              <wp:anchor distT="0" distB="0" distL="114300" distR="114300" simplePos="0" relativeHeight="251662337" behindDoc="0" locked="0" layoutInCell="1" allowOverlap="1" wp14:anchorId="72A40F2A" wp14:editId="1AE6AB95">
                 <wp:simplePos x="0" y="0"/>
                 <wp:positionH relativeFrom="column">
                   <wp:posOffset>-914400</wp:posOffset>
@@ -117,7 +117,7 @@
           <w:sz w:val="56"/>
         </w:rPr>
         <w:drawing>
-          <wp:anchor distT="0" distB="0" distL="114300" distR="114300" simplePos="0" relativeHeight="251658241" behindDoc="0" locked="0" layoutInCell="1" allowOverlap="1" wp14:anchorId="18BBFF14" wp14:editId="7F355C1B">
+          <wp:anchor distT="0" distB="0" distL="114300" distR="114300" simplePos="0" relativeHeight="251658241" behindDoc="0" locked="0" layoutInCell="1" allowOverlap="1" wp14:anchorId="1E512735" wp14:editId="2A59D8F3">
             <wp:simplePos x="0" y="0"/>
             <wp:positionH relativeFrom="margin">
               <wp:posOffset>0</wp:posOffset>
@@ -192,7 +192,7 @@
         <mc:AlternateContent>
           <mc:Choice Requires="wps">
             <w:drawing>
-              <wp:anchor distT="0" distB="0" distL="114300" distR="114300" simplePos="0" relativeHeight="251658240" behindDoc="1" locked="1" layoutInCell="1" allowOverlap="1" wp14:anchorId="3D1B80B4" wp14:editId="63254DD5">
+              <wp:anchor distT="0" distB="0" distL="114300" distR="114300" simplePos="0" relativeHeight="251658240" behindDoc="1" locked="1" layoutInCell="1" allowOverlap="1" wp14:anchorId="53E49AB3" wp14:editId="040F9641">
                 <wp:simplePos x="0" y="0"/>
                 <wp:positionH relativeFrom="page">
                   <wp:posOffset>0</wp:posOffset>
@@ -308,7 +308,7 @@
           <w:szCs w:val="56"/>
         </w:rPr>
         <w:drawing>
-          <wp:anchor distT="0" distB="0" distL="114300" distR="114300" simplePos="0" relativeHeight="251660289" behindDoc="0" locked="0" layoutInCell="1" allowOverlap="1" wp14:anchorId="2927D96B" wp14:editId="78CCAD11">
+          <wp:anchor distT="0" distB="0" distL="114300" distR="114300" simplePos="0" relativeHeight="251660289" behindDoc="0" locked="0" layoutInCell="1" allowOverlap="1" wp14:anchorId="6503EB31" wp14:editId="62629DC0">
             <wp:simplePos x="0" y="0"/>
             <wp:positionH relativeFrom="column">
               <wp:posOffset>104774</wp:posOffset>
@@ -401,7 +401,7 @@
         <mc:AlternateContent>
           <mc:Choice Requires="wps">
             <w:drawing>
-              <wp:anchor distT="0" distB="0" distL="114300" distR="114300" simplePos="0" relativeHeight="251661313" behindDoc="0" locked="0" layoutInCell="1" allowOverlap="1" wp14:anchorId="5F186527" wp14:editId="45ED6C4C">
+              <wp:anchor distT="0" distB="0" distL="114300" distR="114300" simplePos="0" relativeHeight="251661313" behindDoc="0" locked="0" layoutInCell="1" allowOverlap="1" wp14:anchorId="7C4ABE9D" wp14:editId="5A7F9481">
                 <wp:simplePos x="0" y="0"/>
                 <wp:positionH relativeFrom="column">
                   <wp:posOffset>0</wp:posOffset>
@@ -643,8 +643,8 @@
             </w:rPr>
             <w:fldChar w:fldCharType="separate"/>
           </w:r>
-          <w:hyperlink w:anchor="_Toc228342981" w:history="1">
-            <w:bookmarkStart w:id="0" w:name="_Toc228343001"/>
+          <w:hyperlink w:anchor="_Toc228775520" w:history="1">
+            <w:bookmarkStart w:id="0" w:name="_Toc228775540"/>
             <w:r>
               <w:rPr>
                 <w:rStyle w:val="Hyperlink"/>
@@ -671,7 +671,7 @@
                 <w:noProof/>
                 <w:webHidden/>
               </w:rPr>
-              <w:instrText xml:space="preserve"> PAGEREF _Toc228342981 \h </w:instrText>
+              <w:instrText xml:space="preserve"> PAGEREF _Toc228775520 \h </w:instrText>
             </w:r>
             <w:r>
               <w:rPr>
@@ -719,8 +719,8 @@
               <w14:ligatures w14:val="standardContextual"/>
             </w:rPr>
           </w:pPr>
-          <w:hyperlink w:anchor="_Toc228342982" w:history="1">
-            <w:bookmarkStart w:id="1" w:name="_Toc228343002"/>
+          <w:hyperlink w:anchor="_Toc228775521" w:history="1">
+            <w:bookmarkStart w:id="1" w:name="_Toc228775541"/>
             <w:r>
               <w:rPr>
                 <w:rStyle w:val="Hyperlink"/>
@@ -747,7 +747,7 @@
                 <w:noProof/>
                 <w:webHidden/>
               </w:rPr>
-              <w:instrText xml:space="preserve"> PAGEREF _Toc228342982 \h </w:instrText>
+              <w:instrText xml:space="preserve"> PAGEREF _Toc228775521 \h </w:instrText>
             </w:r>
             <w:r>
               <w:rPr>
@@ -795,8 +795,8 @@
               <w14:ligatures w14:val="standardContextual"/>
             </w:rPr>
           </w:pPr>
-          <w:hyperlink w:anchor="_Toc228342983" w:history="1">
-            <w:bookmarkStart w:id="2" w:name="_Toc228343003"/>
+          <w:hyperlink w:anchor="_Toc228775522" w:history="1">
+            <w:bookmarkStart w:id="2" w:name="_Toc228775542"/>
             <w:r>
               <w:rPr>
                 <w:rStyle w:val="Hyperlink"/>
@@ -823,7 +823,7 @@
                 <w:noProof/>
                 <w:webHidden/>
               </w:rPr>
-              <w:instrText xml:space="preserve"> PAGEREF _Toc228342983 \h </w:instrText>
+              <w:instrText xml:space="preserve"> PAGEREF _Toc228775522 \h </w:instrText>
             </w:r>
             <w:r>
               <w:rPr>
@@ -871,8 +871,8 @@
               <w14:ligatures w14:val="standardContextual"/>
             </w:rPr>
           </w:pPr>
-          <w:hyperlink w:anchor="_Toc228342984" w:history="1">
-            <w:bookmarkStart w:id="3" w:name="_Toc228343004"/>
+          <w:hyperlink w:anchor="_Toc228775523" w:history="1">
+            <w:bookmarkStart w:id="3" w:name="_Toc228775543"/>
             <w:r>
               <w:rPr>
                 <w:rStyle w:val="Hyperlink"/>
@@ -899,7 +899,7 @@
                 <w:noProof/>
                 <w:webHidden/>
               </w:rPr>
-              <w:instrText xml:space="preserve"> PAGEREF _Toc228342984 \h </w:instrText>
+              <w:instrText xml:space="preserve"> PAGEREF _Toc228775523 \h </w:instrText>
             </w:r>
             <w:r>
               <w:rPr>
@@ -943,7 +943,7 @@
               <w14:ligatures w14:val="standardContextual"/>
             </w:rPr>
           </w:pPr>
-          <w:hyperlink w:anchor="_Toc228342985" w:history="1">
+          <w:hyperlink w:anchor="_Toc228775524" w:history="1">
             <w:r>
               <w:rPr>
                 <w:rStyle w:val="Hyperlink"/>
@@ -970,7 +970,7 @@
                 <w:noProof/>
                 <w:webHidden/>
               </w:rPr>
-              <w:instrText xml:space="preserve"> PAGEREF _Toc228342985 \h </w:instrText>
+              <w:instrText xml:space="preserve"> PAGEREF _Toc228775524 \h </w:instrText>
             </w:r>
             <w:r>
               <w:rPr>
@@ -1013,7 +1013,7 @@
               <w14:ligatures w14:val="standardContextual"/>
             </w:rPr>
           </w:pPr>
-          <w:hyperlink w:anchor="_Toc228342986" w:history="1">
+          <w:hyperlink w:anchor="_Toc228775525" w:history="1">
             <w:r>
               <w:rPr>
                 <w:rStyle w:val="Hyperlink"/>
@@ -1040,7 +1040,7 @@
                 <w:noProof/>
                 <w:webHidden/>
               </w:rPr>
-              <w:instrText xml:space="preserve"> PAGEREF _Toc228342986 \h </w:instrText>
+              <w:instrText xml:space="preserve"> PAGEREF _Toc228775525 \h </w:instrText>
             </w:r>
             <w:r>
               <w:rPr>
@@ -1087,8 +1087,8 @@
               <w14:ligatures w14:val="standardContextual"/>
             </w:rPr>
           </w:pPr>
-          <w:hyperlink w:anchor="_Toc228342987" w:history="1">
-            <w:bookmarkStart w:id="4" w:name="_Toc228343005"/>
+          <w:hyperlink w:anchor="_Toc228775526" w:history="1">
+            <w:bookmarkStart w:id="4" w:name="_Toc228775544"/>
             <w:r>
               <w:rPr>
                 <w:rStyle w:val="Hyperlink"/>
@@ -1115,7 +1115,7 @@
                 <w:noProof/>
                 <w:webHidden/>
               </w:rPr>
-              <w:instrText xml:space="preserve"> PAGEREF _Toc228342987 \h </w:instrText>
+              <w:instrText xml:space="preserve"> PAGEREF _Toc228775526 \h </w:instrText>
             </w:r>
             <w:r>
               <w:rPr>
@@ -1163,8 +1163,8 @@
               <w14:ligatures w14:val="standardContextual"/>
             </w:rPr>
           </w:pPr>
-          <w:hyperlink w:anchor="_Toc228342988" w:history="1">
-            <w:bookmarkStart w:id="5" w:name="_Toc228343006"/>
+          <w:hyperlink w:anchor="_Toc228775527" w:history="1">
+            <w:bookmarkStart w:id="5" w:name="_Toc228775545"/>
             <w:r>
               <w:rPr>
                 <w:rStyle w:val="Hyperlink"/>
@@ -1191,7 +1191,7 @@
                 <w:noProof/>
                 <w:webHidden/>
               </w:rPr>
-              <w:instrText xml:space="preserve"> PAGEREF _Toc228342988 \h </w:instrText>
+              <w:instrText xml:space="preserve"> PAGEREF _Toc228775527 \h </w:instrText>
             </w:r>
             <w:r>
               <w:rPr>
@@ -1239,8 +1239,8 @@
               <w14:ligatures w14:val="standardContextual"/>
             </w:rPr>
           </w:pPr>
-          <w:hyperlink w:anchor="_Toc228342989" w:history="1">
-            <w:bookmarkStart w:id="6" w:name="_Toc228343007"/>
+          <w:hyperlink w:anchor="_Toc228775528" w:history="1">
+            <w:bookmarkStart w:id="6" w:name="_Toc228775546"/>
             <w:r>
               <w:rPr>
                 <w:rStyle w:val="Hyperlink"/>
@@ -1267,7 +1267,7 @@
                 <w:noProof/>
                 <w:webHidden/>
               </w:rPr>
-              <w:instrText xml:space="preserve"> PAGEREF _Toc228342989 \h </w:instrText>
+              <w:instrText xml:space="preserve"> PAGEREF _Toc228775528 \h </w:instrText>
             </w:r>
             <w:r>
               <w:rPr>
@@ -1311,7 +1311,7 @@
               <w14:ligatures w14:val="standardContextual"/>
             </w:rPr>
           </w:pPr>
-          <w:hyperlink w:anchor="_Toc228342990" w:history="1">
+          <w:hyperlink w:anchor="_Toc228775529" w:history="1">
             <w:r>
               <w:rPr>
                 <w:rStyle w:val="Hyperlink"/>
@@ -1346,7 +1346,7 @@
                 <w:noProof/>
                 <w:webHidden/>
               </w:rPr>
-              <w:instrText xml:space="preserve"> PAGEREF _Toc228342990 \h </w:instrText>
+              <w:instrText xml:space="preserve"> PAGEREF _Toc228775529 \h </w:instrText>
             </w:r>
             <w:r>
               <w:rPr>
@@ -1389,7 +1389,7 @@
               <w14:ligatures w14:val="standardContextual"/>
             </w:rPr>
           </w:pPr>
-          <w:hyperlink w:anchor="_Toc228342991" w:history="1">
+          <w:hyperlink w:anchor="_Toc228775530" w:history="1">
             <w:r>
               <w:rPr>
                 <w:rStyle w:val="Hyperlink"/>
@@ -1424,7 +1424,7 @@
                 <w:noProof/>
                 <w:webHidden/>
               </w:rPr>
-              <w:instrText xml:space="preserve"> PAGEREF _Toc228342991 \h </w:instrText>
+              <w:instrText xml:space="preserve"> PAGEREF _Toc228775530 \h </w:instrText>
             </w:r>
             <w:r>
               <w:rPr>
@@ -1471,8 +1471,8 @@
               <w14:ligatures w14:val="standardContextual"/>
             </w:rPr>
           </w:pPr>
-          <w:hyperlink w:anchor="_Toc228342992" w:history="1">
-            <w:bookmarkStart w:id="7" w:name="_Toc228343008"/>
+          <w:hyperlink w:anchor="_Toc228775531" w:history="1">
+            <w:bookmarkStart w:id="7" w:name="_Toc228775547"/>
             <w:r>
               <w:rPr>
                 <w:rStyle w:val="Hyperlink"/>
@@ -1499,7 +1499,7 @@
                 <w:noProof/>
                 <w:webHidden/>
               </w:rPr>
-              <w:instrText xml:space="preserve"> PAGEREF _Toc228342992 \h </w:instrText>
+              <w:instrText xml:space="preserve"> PAGEREF _Toc228775531 \h </w:instrText>
             </w:r>
             <w:r>
               <w:rPr>
@@ -1543,7 +1543,7 @@
               <w14:ligatures w14:val="standardContextual"/>
             </w:rPr>
           </w:pPr>
-          <w:hyperlink w:anchor="_Toc228342993" w:history="1">
+          <w:hyperlink w:anchor="_Toc228775532" w:history="1">
             <w:r>
               <w:rPr>
                 <w:rStyle w:val="Hyperlink"/>
@@ -1578,7 +1578,7 @@
                 <w:noProof/>
                 <w:webHidden/>
               </w:rPr>
-              <w:instrText xml:space="preserve"> PAGEREF _Toc228342993 \h </w:instrText>
+              <w:instrText xml:space="preserve"> PAGEREF _Toc228775532 \h </w:instrText>
             </w:r>
             <w:r>
               <w:rPr>
@@ -1621,7 +1621,7 @@
               <w14:ligatures w14:val="standardContextual"/>
             </w:rPr>
           </w:pPr>
-          <w:hyperlink w:anchor="_Toc228342994" w:history="1">
+          <w:hyperlink w:anchor="_Toc228775533" w:history="1">
             <w:r>
               <w:rPr>
                 <w:rStyle w:val="Hyperlink"/>
@@ -1656,7 +1656,7 @@
                 <w:noProof/>
                 <w:webHidden/>
               </w:rPr>
-              <w:instrText xml:space="preserve"> PAGEREF _Toc228342994 \h </w:instrText>
+              <w:instrText xml:space="preserve"> PAGEREF _Toc228775533 \h </w:instrText>
             </w:r>
             <w:r>
               <w:rPr>
@@ -1703,8 +1703,8 @@
               <w14:ligatures w14:val="standardContextual"/>
             </w:rPr>
           </w:pPr>
-          <w:hyperlink w:anchor="_Toc228342995" w:history="1">
-            <w:bookmarkStart w:id="8" w:name="_Toc228343009"/>
+          <w:hyperlink w:anchor="_Toc228775534" w:history="1">
+            <w:bookmarkStart w:id="8" w:name="_Toc228775548"/>
             <w:r>
               <w:rPr>
                 <w:rStyle w:val="Hyperlink"/>
@@ -1731,7 +1731,7 @@
                 <w:noProof/>
                 <w:webHidden/>
               </w:rPr>
-              <w:instrText xml:space="preserve"> PAGEREF _Toc228342995 \h </w:instrText>
+              <w:instrText xml:space="preserve"> PAGEREF _Toc228775534 \h </w:instrText>
             </w:r>
             <w:r>
               <w:rPr>
@@ -1779,8 +1779,8 @@
               <w14:ligatures w14:val="standardContextual"/>
             </w:rPr>
           </w:pPr>
-          <w:hyperlink w:anchor="_Toc228342996" w:history="1">
-            <w:bookmarkStart w:id="9" w:name="_Toc228343010"/>
+          <w:hyperlink w:anchor="_Toc228775535" w:history="1">
+            <w:bookmarkStart w:id="9" w:name="_Toc228775549"/>
             <w:r>
               <w:rPr>
                 <w:rStyle w:val="Hyperlink"/>
@@ -1807,7 +1807,7 @@
                 <w:noProof/>
                 <w:webHidden/>
               </w:rPr>
-              <w:instrText xml:space="preserve"> PAGEREF _Toc228342996 \h </w:instrText>
+              <w:instrText xml:space="preserve"> PAGEREF _Toc228775535 \h </w:instrText>
             </w:r>
             <w:r>
               <w:rPr>
@@ -1855,8 +1855,8 @@
               <w14:ligatures w14:val="standardContextual"/>
             </w:rPr>
           </w:pPr>
-          <w:hyperlink w:anchor="_Toc228342997" w:history="1">
-            <w:bookmarkStart w:id="10" w:name="_Toc228343011"/>
+          <w:hyperlink w:anchor="_Toc228775536" w:history="1">
+            <w:bookmarkStart w:id="10" w:name="_Toc228775550"/>
             <w:r>
               <w:rPr>
                 <w:rStyle w:val="Hyperlink"/>
@@ -1883,7 +1883,7 @@
                 <w:noProof/>
                 <w:webHidden/>
               </w:rPr>
-              <w:instrText xml:space="preserve"> PAGEREF _Toc228342997 \h </w:instrText>
+              <w:instrText xml:space="preserve"> PAGEREF _Toc228775536 \h </w:instrText>
             </w:r>
             <w:r>
               <w:rPr>
@@ -1931,8 +1931,8 @@
               <w14:ligatures w14:val="standardContextual"/>
             </w:rPr>
           </w:pPr>
-          <w:hyperlink w:anchor="_Toc228342998" w:history="1">
-            <w:bookmarkStart w:id="11" w:name="_Toc228343012"/>
+          <w:hyperlink w:anchor="_Toc228775537" w:history="1">
+            <w:bookmarkStart w:id="11" w:name="_Toc228775551"/>
             <w:r>
               <w:rPr>
                 <w:rStyle w:val="Hyperlink"/>
@@ -1959,7 +1959,7 @@
                 <w:noProof/>
                 <w:webHidden/>
               </w:rPr>
-              <w:instrText xml:space="preserve"> PAGEREF _Toc228342998 \h </w:instrText>
+              <w:instrText xml:space="preserve"> PAGEREF _Toc228775537 \h </w:instrText>
             </w:r>
             <w:r>
               <w:rPr>
@@ -2007,8 +2007,8 @@
               <w14:ligatures w14:val="standardContextual"/>
             </w:rPr>
           </w:pPr>
-          <w:hyperlink w:anchor="_Toc228342999" w:history="1">
-            <w:bookmarkStart w:id="12" w:name="_Toc228343013"/>
+          <w:hyperlink w:anchor="_Toc228775538" w:history="1">
+            <w:bookmarkStart w:id="12" w:name="_Toc228775552"/>
             <w:r>
               <w:rPr>
                 <w:rStyle w:val="Hyperlink"/>
@@ -2035,7 +2035,7 @@
                 <w:noProof/>
                 <w:webHidden/>
               </w:rPr>
-              <w:instrText xml:space="preserve"> PAGEREF _Toc228342999 \h </w:instrText>
+              <w:instrText xml:space="preserve"> PAGEREF _Toc228775538 \h </w:instrText>
             </w:r>
             <w:r>
               <w:rPr>
@@ -2083,8 +2083,8 @@
               <w14:ligatures w14:val="standardContextual"/>
             </w:rPr>
           </w:pPr>
-          <w:hyperlink w:anchor="_Toc228343000" w:history="1">
-            <w:bookmarkStart w:id="13" w:name="_Toc228343014"/>
+          <w:hyperlink w:anchor="_Toc228775539" w:history="1">
+            <w:bookmarkStart w:id="13" w:name="_Toc228775553"/>
             <w:r>
               <w:rPr>
                 <w:rStyle w:val="Hyperlink"/>
@@ -2111,7 +2111,7 @@
                 <w:noProof/>
                 <w:webHidden/>
               </w:rPr>
-              <w:instrText xml:space="preserve"> PAGEREF _Toc228343000 \h </w:instrText>
+              <w:instrText xml:space="preserve"> PAGEREF _Toc228775539 \h </w:instrText>
             </w:r>
             <w:r>
               <w:rPr>
@@ -2165,8 +2165,8 @@
       <w:pPr>
         <w:pStyle w:val="Heading1"/>
       </w:pPr>
-      <w:bookmarkStart w:id="14" w:name="_Toc228342981"/>
-      <w:bookmarkStart w:id="15" w:name="_Toc228343015"/>
+      <w:bookmarkStart w:id="14" w:name="_Toc228775520"/>
+      <w:bookmarkStart w:id="15" w:name="_Toc228775554"/>
       <w:r>
         <w:lastRenderedPageBreak/>
         <w:t>Table of Contents</w:t>
@@ -2202,7 +2202,7 @@
       <w:r>
         <w:fldChar w:fldCharType="separate"/>
       </w:r>
-      <w:hyperlink w:anchor="_Toc228343001" w:history="1">
+      <w:hyperlink w:anchor="_Toc228775540" w:history="1">
         <w:r>
           <w:rPr>
             <w:rStyle w:val="Hyperlink"/>
@@ -2251,7 +2251,7 @@
             <w:noProof/>
             <w:webHidden/>
           </w:rPr>
-          <w:instrText xml:space="preserve"> PAGEREF _Toc228343001 \h </w:instrText>
+          <w:instrText xml:space="preserve"> PAGEREF _Toc228775540 \h </w:instrText>
         </w:r>
         <w:r>
           <w:rPr>
@@ -2297,7 +2297,7 @@
           <w14:ligatures w14:val="standardContextual"/>
         </w:rPr>
       </w:pPr>
-      <w:hyperlink w:anchor="_Toc228343002" w:history="1">
+      <w:hyperlink w:anchor="_Toc228775541" w:history="1">
         <w:r>
           <w:rPr>
             <w:rStyle w:val="Hyperlink"/>
@@ -2342,7 +2342,7 @@
             <w:noProof/>
             <w:webHidden/>
           </w:rPr>
-          <w:instrText xml:space="preserve"> PAGEREF _Toc228343002 \h </w:instrText>
+          <w:instrText xml:space="preserve"> PAGEREF _Toc228775541 \h </w:instrText>
         </w:r>
         <w:r>
           <w:rPr>
@@ -2388,7 +2388,7 @@
           <w14:ligatures w14:val="standardContextual"/>
         </w:rPr>
       </w:pPr>
-      <w:hyperlink w:anchor="_Toc228343003" w:history="1">
+      <w:hyperlink w:anchor="_Toc228775542" w:history="1">
         <w:r>
           <w:rPr>
             <w:rStyle w:val="Hyperlink"/>
@@ -2433,7 +2433,7 @@
             <w:noProof/>
             <w:webHidden/>
           </w:rPr>
-          <w:instrText xml:space="preserve"> PAGEREF _Toc228343003 \h </w:instrText>
+          <w:instrText xml:space="preserve"> PAGEREF _Toc228775542 \h </w:instrText>
         </w:r>
         <w:r>
           <w:rPr>
@@ -2479,7 +2479,7 @@
           <w14:ligatures w14:val="standardContextual"/>
         </w:rPr>
       </w:pPr>
-      <w:hyperlink w:anchor="_Toc228343004" w:history="1">
+      <w:hyperlink w:anchor="_Toc228775543" w:history="1">
         <w:r>
           <w:rPr>
             <w:rStyle w:val="Hyperlink"/>
@@ -2524,7 +2524,7 @@
             <w:noProof/>
             <w:webHidden/>
           </w:rPr>
-          <w:instrText xml:space="preserve"> PAGEREF _Toc228343004 \h </w:instrText>
+          <w:instrText xml:space="preserve"> PAGEREF _Toc228775543 \h </w:instrText>
         </w:r>
         <w:r>
           <w:rPr>
@@ -2570,7 +2570,7 @@
           <w14:ligatures w14:val="standardContextual"/>
         </w:rPr>
       </w:pPr>
-      <w:hyperlink w:anchor="_Toc228343005" w:history="1">
+      <w:hyperlink w:anchor="_Toc228775544" w:history="1">
         <w:r>
           <w:rPr>
             <w:rStyle w:val="Hyperlink"/>
@@ -2615,7 +2615,7 @@
             <w:noProof/>
             <w:webHidden/>
           </w:rPr>
-          <w:instrText xml:space="preserve"> PAGEREF _Toc228343005 \h </w:instrText>
+          <w:instrText xml:space="preserve"> PAGEREF _Toc228775544 \h </w:instrText>
         </w:r>
         <w:r>
           <w:rPr>
@@ -2661,7 +2661,7 @@
           <w14:ligatures w14:val="standardContextual"/>
         </w:rPr>
       </w:pPr>
-      <w:hyperlink w:anchor="_Toc228343006" w:history="1">
+      <w:hyperlink w:anchor="_Toc228775545" w:history="1">
         <w:r>
           <w:rPr>
             <w:rStyle w:val="Hyperlink"/>
@@ -2706,7 +2706,7 @@
             <w:noProof/>
             <w:webHidden/>
           </w:rPr>
-          <w:instrText xml:space="preserve"> PAGEREF _Toc228343006 \h </w:instrText>
+          <w:instrText xml:space="preserve"> PAGEREF _Toc228775545 \h </w:instrText>
         </w:r>
         <w:r>
           <w:rPr>
@@ -2752,7 +2752,7 @@
           <w14:ligatures w14:val="standardContextual"/>
         </w:rPr>
       </w:pPr>
-      <w:hyperlink w:anchor="_Toc228343007" w:history="1">
+      <w:hyperlink w:anchor="_Toc228775546" w:history="1">
         <w:r>
           <w:rPr>
             <w:rStyle w:val="Hyperlink"/>
@@ -2797,7 +2797,7 @@
             <w:noProof/>
             <w:webHidden/>
           </w:rPr>
-          <w:instrText xml:space="preserve"> PAGEREF _Toc228343007 \h </w:instrText>
+          <w:instrText xml:space="preserve"> PAGEREF _Toc228775546 \h </w:instrText>
         </w:r>
         <w:r>
           <w:rPr>
@@ -2843,7 +2843,7 @@
           <w14:ligatures w14:val="standardContextual"/>
         </w:rPr>
       </w:pPr>
-      <w:hyperlink w:anchor="_Toc228343008" w:history="1">
+      <w:hyperlink w:anchor="_Toc228775547" w:history="1">
         <w:r>
           <w:rPr>
             <w:rStyle w:val="Hyperlink"/>
@@ -2888,7 +2888,7 @@
             <w:noProof/>
             <w:webHidden/>
           </w:rPr>
-          <w:instrText xml:space="preserve"> PAGEREF _Toc228343008 \h </w:instrText>
+          <w:instrText xml:space="preserve"> PAGEREF _Toc228775547 \h </w:instrText>
         </w:r>
         <w:r>
           <w:rPr>
@@ -2934,7 +2934,7 @@
           <w14:ligatures w14:val="standardContextual"/>
         </w:rPr>
       </w:pPr>
-      <w:hyperlink w:anchor="_Toc228343009" w:history="1">
+      <w:hyperlink w:anchor="_Toc228775548" w:history="1">
         <w:r>
           <w:rPr>
             <w:rStyle w:val="Hyperlink"/>
@@ -2979,7 +2979,7 @@
             <w:noProof/>
             <w:webHidden/>
           </w:rPr>
-          <w:instrText xml:space="preserve"> PAGEREF _Toc228343009 \h </w:instrText>
+          <w:instrText xml:space="preserve"> PAGEREF _Toc228775548 \h </w:instrText>
         </w:r>
         <w:r>
           <w:rPr>
@@ -3025,7 +3025,7 @@
           <w14:ligatures w14:val="standardContextual"/>
         </w:rPr>
       </w:pPr>
-      <w:hyperlink w:anchor="_Toc228343010" w:history="1">
+      <w:hyperlink w:anchor="_Toc228775549" w:history="1">
         <w:r>
           <w:rPr>
             <w:rStyle w:val="Hyperlink"/>
@@ -3070,7 +3070,7 @@
             <w:noProof/>
             <w:webHidden/>
           </w:rPr>
-          <w:instrText xml:space="preserve"> PAGEREF _Toc228343010 \h </w:instrText>
+          <w:instrText xml:space="preserve"> PAGEREF _Toc228775549 \h </w:instrText>
         </w:r>
         <w:r>
           <w:rPr>
@@ -3116,7 +3116,7 @@
           <w14:ligatures w14:val="standardContextual"/>
         </w:rPr>
       </w:pPr>
-      <w:hyperlink w:anchor="_Toc228343011" w:history="1">
+      <w:hyperlink w:anchor="_Toc228775550" w:history="1">
         <w:r>
           <w:rPr>
             <w:rStyle w:val="Hyperlink"/>
@@ -3161,7 +3161,7 @@
             <w:noProof/>
             <w:webHidden/>
           </w:rPr>
-          <w:instrText xml:space="preserve"> PAGEREF _Toc228343011 \h </w:instrText>
+          <w:instrText xml:space="preserve"> PAGEREF _Toc228775550 \h </w:instrText>
         </w:r>
         <w:r>
           <w:rPr>
@@ -3207,7 +3207,7 @@
           <w14:ligatures w14:val="standardContextual"/>
         </w:rPr>
       </w:pPr>
-      <w:hyperlink w:anchor="_Toc228343012" w:history="1">
+      <w:hyperlink w:anchor="_Toc228775551" w:history="1">
         <w:r>
           <w:rPr>
             <w:rStyle w:val="Hyperlink"/>
@@ -3252,7 +3252,7 @@
             <w:noProof/>
             <w:webHidden/>
           </w:rPr>
-          <w:instrText xml:space="preserve"> PAGEREF _Toc228343012 \h </w:instrText>
+          <w:instrText xml:space="preserve"> PAGEREF _Toc228775551 \h </w:instrText>
         </w:r>
         <w:r>
           <w:rPr>
@@ -3298,7 +3298,7 @@
           <w14:ligatures w14:val="standardContextual"/>
         </w:rPr>
       </w:pPr>
-      <w:hyperlink w:anchor="_Toc228343013" w:history="1">
+      <w:hyperlink w:anchor="_Toc228775552" w:history="1">
         <w:r>
           <w:rPr>
             <w:rStyle w:val="Hyperlink"/>
@@ -3343,7 +3343,7 @@
             <w:noProof/>
             <w:webHidden/>
           </w:rPr>
-          <w:instrText xml:space="preserve"> PAGEREF _Toc228343013 \h </w:instrText>
+          <w:instrText xml:space="preserve"> PAGEREF _Toc228775552 \h </w:instrText>
         </w:r>
         <w:r>
           <w:rPr>
@@ -3389,7 +3389,7 @@
           <w14:ligatures w14:val="standardContextual"/>
         </w:rPr>
       </w:pPr>
-      <w:hyperlink w:anchor="_Toc228343014" w:history="1">
+      <w:hyperlink w:anchor="_Toc228775553" w:history="1">
         <w:r>
           <w:rPr>
             <w:rStyle w:val="Hyperlink"/>
@@ -3434,7 +3434,7 @@
             <w:noProof/>
             <w:webHidden/>
           </w:rPr>
-          <w:instrText xml:space="preserve"> PAGEREF _Toc228343014 \h </w:instrText>
+          <w:instrText xml:space="preserve"> PAGEREF _Toc228775553 \h </w:instrText>
         </w:r>
         <w:r>
           <w:rPr>
@@ -3479,7 +3479,7 @@
           <w14:ligatures w14:val="standardContextual"/>
         </w:rPr>
       </w:pPr>
-      <w:hyperlink w:anchor="_Toc228343015" w:history="1">
+      <w:hyperlink w:anchor="_Toc228775554" w:history="1">
         <w:r>
           <w:rPr>
             <w:rStyle w:val="Hyperlink"/>
@@ -3506,7 +3506,7 @@
             <w:noProof/>
             <w:webHidden/>
           </w:rPr>
-          <w:instrText xml:space="preserve"> PAGEREF _Toc228343015 \h </w:instrText>
+          <w:instrText xml:space="preserve"> PAGEREF _Toc228775554 \h </w:instrText>
         </w:r>
         <w:r>
           <w:rPr>
@@ -3553,7 +3553,7 @@
           <w14:ligatures w14:val="standardContextual"/>
         </w:rPr>
       </w:pPr>
-      <w:hyperlink w:anchor="_Toc228343016" w:history="1">
+      <w:hyperlink w:anchor="_Toc228775555" w:history="1">
         <w:r>
           <w:rPr>
             <w:rStyle w:val="Hyperlink"/>
@@ -3580,7 +3580,7 @@
             <w:noProof/>
             <w:webHidden/>
           </w:rPr>
-          <w:instrText xml:space="preserve"> PAGEREF _Toc228343016 \h </w:instrText>
+          <w:instrText xml:space="preserve"> PAGEREF _Toc228775555 \h </w:instrText>
         </w:r>
         <w:r>
           <w:rPr>
@@ -3627,7 +3627,7 @@
           <w14:ligatures w14:val="standardContextual"/>
         </w:rPr>
       </w:pPr>
-      <w:hyperlink w:anchor="_Toc228343017" w:history="1">
+      <w:hyperlink w:anchor="_Toc228775556" w:history="1">
         <w:r>
           <w:rPr>
             <w:rStyle w:val="Hyperlink"/>
@@ -3654,7 +3654,7 @@
             <w:noProof/>
             <w:webHidden/>
           </w:rPr>
-          <w:instrText xml:space="preserve"> PAGEREF _Toc228343017 \h </w:instrText>
+          <w:instrText xml:space="preserve"> PAGEREF _Toc228775556 \h </w:instrText>
         </w:r>
         <w:r>
           <w:rPr>
@@ -3701,7 +3701,7 @@
           <w14:ligatures w14:val="standardContextual"/>
         </w:rPr>
       </w:pPr>
-      <w:hyperlink w:anchor="_Toc228343018" w:history="1">
+      <w:hyperlink w:anchor="_Toc228775557" w:history="1">
         <w:r>
           <w:rPr>
             <w:rStyle w:val="Hyperlink"/>
@@ -3728,7 +3728,7 @@
             <w:noProof/>
             <w:webHidden/>
           </w:rPr>
-          <w:instrText xml:space="preserve"> PAGEREF _Toc228343018 \h </w:instrText>
+          <w:instrText xml:space="preserve"> PAGEREF _Toc228775557 \h </w:instrText>
         </w:r>
         <w:r>
           <w:rPr>
@@ -3771,7 +3771,7 @@
           <w14:ligatures w14:val="standardContextual"/>
         </w:rPr>
       </w:pPr>
-      <w:hyperlink w:anchor="_Toc228343019" w:history="1">
+      <w:hyperlink w:anchor="_Toc228775558" w:history="1">
         <w:r>
           <w:rPr>
             <w:rStyle w:val="Hyperlink"/>
@@ -3798,7 +3798,7 @@
             <w:noProof/>
             <w:webHidden/>
           </w:rPr>
-          <w:instrText xml:space="preserve"> PAGEREF _Toc228343019 \h </w:instrText>
+          <w:instrText xml:space="preserve"> PAGEREF _Toc228775558 \h </w:instrText>
         </w:r>
         <w:r>
           <w:rPr>
@@ -3841,7 +3841,7 @@
           <w14:ligatures w14:val="standardContextual"/>
         </w:rPr>
       </w:pPr>
-      <w:hyperlink w:anchor="_Toc228343020" w:history="1">
+      <w:hyperlink w:anchor="_Toc228775559" w:history="1">
         <w:r>
           <w:rPr>
             <w:rStyle w:val="Hyperlink"/>
@@ -3868,7 +3868,7 @@
             <w:noProof/>
             <w:webHidden/>
           </w:rPr>
-          <w:instrText xml:space="preserve"> PAGEREF _Toc228343020 \h </w:instrText>
+          <w:instrText xml:space="preserve"> PAGEREF _Toc228775559 \h </w:instrText>
         </w:r>
         <w:r>
           <w:rPr>
@@ -3915,7 +3915,7 @@
           <w14:ligatures w14:val="standardContextual"/>
         </w:rPr>
       </w:pPr>
-      <w:hyperlink w:anchor="_Toc228343021" w:history="1">
+      <w:hyperlink w:anchor="_Toc228775560" w:history="1">
         <w:r>
           <w:rPr>
             <w:rStyle w:val="Hyperlink"/>
@@ -3942,7 +3942,7 @@
             <w:noProof/>
             <w:webHidden/>
           </w:rPr>
-          <w:instrText xml:space="preserve"> PAGEREF _Toc228343021 \h </w:instrText>
+          <w:instrText xml:space="preserve"> PAGEREF _Toc228775560 \h </w:instrText>
         </w:r>
         <w:r>
           <w:rPr>
@@ -3989,7 +3989,7 @@
           <w14:ligatures w14:val="standardContextual"/>
         </w:rPr>
       </w:pPr>
-      <w:hyperlink w:anchor="_Toc228343022" w:history="1">
+      <w:hyperlink w:anchor="_Toc228775561" w:history="1">
         <w:r>
           <w:rPr>
             <w:rStyle w:val="Hyperlink"/>
@@ -4016,7 +4016,7 @@
             <w:noProof/>
             <w:webHidden/>
           </w:rPr>
-          <w:instrText xml:space="preserve"> PAGEREF _Toc228343022 \h </w:instrText>
+          <w:instrText xml:space="preserve"> PAGEREF _Toc228775561 \h </w:instrText>
         </w:r>
         <w:r>
           <w:rPr>
@@ -4063,7 +4063,7 @@
           <w14:ligatures w14:val="standardContextual"/>
         </w:rPr>
       </w:pPr>
-      <w:hyperlink w:anchor="_Toc228343023" w:history="1">
+      <w:hyperlink w:anchor="_Toc228775562" w:history="1">
         <w:r>
           <w:rPr>
             <w:rStyle w:val="Hyperlink"/>
@@ -4090,7 +4090,7 @@
             <w:noProof/>
             <w:webHidden/>
           </w:rPr>
-          <w:instrText xml:space="preserve"> PAGEREF _Toc228343023 \h </w:instrText>
+          <w:instrText xml:space="preserve"> PAGEREF _Toc228775562 \h </w:instrText>
         </w:r>
         <w:r>
           <w:rPr>
@@ -4133,7 +4133,7 @@
           <w14:ligatures w14:val="standardContextual"/>
         </w:rPr>
       </w:pPr>
-      <w:hyperlink w:anchor="_Toc228343024" w:history="1">
+      <w:hyperlink w:anchor="_Toc228775563" w:history="1">
         <w:r>
           <w:rPr>
             <w:rStyle w:val="Hyperlink"/>
@@ -4168,7 +4168,7 @@
             <w:noProof/>
             <w:webHidden/>
           </w:rPr>
-          <w:instrText xml:space="preserve"> PAGEREF _Toc228343024 \h </w:instrText>
+          <w:instrText xml:space="preserve"> PAGEREF _Toc228775563 \h </w:instrText>
         </w:r>
         <w:r>
           <w:rPr>
@@ -4211,7 +4211,7 @@
           <w14:ligatures w14:val="standardContextual"/>
         </w:rPr>
       </w:pPr>
-      <w:hyperlink w:anchor="_Toc228343025" w:history="1">
+      <w:hyperlink w:anchor="_Toc228775564" w:history="1">
         <w:r>
           <w:rPr>
             <w:rStyle w:val="Hyperlink"/>
@@ -4246,7 +4246,7 @@
             <w:noProof/>
             <w:webHidden/>
           </w:rPr>
-          <w:instrText xml:space="preserve"> PAGEREF _Toc228343025 \h </w:instrText>
+          <w:instrText xml:space="preserve"> PAGEREF _Toc228775564 \h </w:instrText>
         </w:r>
         <w:r>
           <w:rPr>
@@ -4293,7 +4293,7 @@
           <w14:ligatures w14:val="standardContextual"/>
         </w:rPr>
       </w:pPr>
-      <w:hyperlink w:anchor="_Toc228343026" w:history="1">
+      <w:hyperlink w:anchor="_Toc228775565" w:history="1">
         <w:r>
           <w:rPr>
             <w:rStyle w:val="Hyperlink"/>
@@ -4320,7 +4320,7 @@
             <w:noProof/>
             <w:webHidden/>
           </w:rPr>
-          <w:instrText xml:space="preserve"> PAGEREF _Toc228343026 \h </w:instrText>
+          <w:instrText xml:space="preserve"> PAGEREF _Toc228775565 \h </w:instrText>
         </w:r>
         <w:r>
           <w:rPr>
@@ -4363,7 +4363,7 @@
           <w14:ligatures w14:val="standardContextual"/>
         </w:rPr>
       </w:pPr>
-      <w:hyperlink w:anchor="_Toc228343027" w:history="1">
+      <w:hyperlink w:anchor="_Toc228775566" w:history="1">
         <w:r>
           <w:rPr>
             <w:rStyle w:val="Hyperlink"/>
@@ -4398,7 +4398,7 @@
             <w:noProof/>
             <w:webHidden/>
           </w:rPr>
-          <w:instrText xml:space="preserve"> PAGEREF _Toc228343027 \h </w:instrText>
+          <w:instrText xml:space="preserve"> PAGEREF _Toc228775566 \h </w:instrText>
         </w:r>
         <w:r>
           <w:rPr>
@@ -4441,7 +4441,7 @@
           <w14:ligatures w14:val="standardContextual"/>
         </w:rPr>
       </w:pPr>
-      <w:hyperlink w:anchor="_Toc228343028" w:history="1">
+      <w:hyperlink w:anchor="_Toc228775567" w:history="1">
         <w:r>
           <w:rPr>
             <w:rStyle w:val="Hyperlink"/>
@@ -4476,7 +4476,7 @@
             <w:noProof/>
             <w:webHidden/>
           </w:rPr>
-          <w:instrText xml:space="preserve"> PAGEREF _Toc228343028 \h </w:instrText>
+          <w:instrText xml:space="preserve"> PAGEREF _Toc228775567 \h </w:instrText>
         </w:r>
         <w:r>
           <w:rPr>
@@ -4523,7 +4523,7 @@
           <w14:ligatures w14:val="standardContextual"/>
         </w:rPr>
       </w:pPr>
-      <w:hyperlink w:anchor="_Toc228343029" w:history="1">
+      <w:hyperlink w:anchor="_Toc228775568" w:history="1">
         <w:r>
           <w:rPr>
             <w:rStyle w:val="Hyperlink"/>
@@ -4550,7 +4550,7 @@
             <w:noProof/>
             <w:webHidden/>
           </w:rPr>
-          <w:instrText xml:space="preserve"> PAGEREF _Toc228343029 \h </w:instrText>
+          <w:instrText xml:space="preserve"> PAGEREF _Toc228775568 \h </w:instrText>
         </w:r>
         <w:r>
           <w:rPr>
@@ -4597,7 +4597,7 @@
           <w14:ligatures w14:val="standardContextual"/>
         </w:rPr>
       </w:pPr>
-      <w:hyperlink w:anchor="_Toc228343030" w:history="1">
+      <w:hyperlink w:anchor="_Toc228775569" w:history="1">
         <w:r>
           <w:rPr>
             <w:rStyle w:val="Hyperlink"/>
@@ -4624,7 +4624,7 @@
             <w:noProof/>
             <w:webHidden/>
           </w:rPr>
-          <w:instrText xml:space="preserve"> PAGEREF _Toc228343030 \h </w:instrText>
+          <w:instrText xml:space="preserve"> PAGEREF _Toc228775569 \h </w:instrText>
         </w:r>
         <w:r>
           <w:rPr>
@@ -4671,7 +4671,7 @@
           <w14:ligatures w14:val="standardContextual"/>
         </w:rPr>
       </w:pPr>
-      <w:hyperlink w:anchor="_Toc228343031" w:history="1">
+      <w:hyperlink w:anchor="_Toc228775570" w:history="1">
         <w:r>
           <w:rPr>
             <w:rStyle w:val="Hyperlink"/>
@@ -4698,7 +4698,7 @@
             <w:noProof/>
             <w:webHidden/>
           </w:rPr>
-          <w:instrText xml:space="preserve"> PAGEREF _Toc228343031 \h </w:instrText>
+          <w:instrText xml:space="preserve"> PAGEREF _Toc228775570 \h </w:instrText>
         </w:r>
         <w:r>
           <w:rPr>
@@ -4745,7 +4745,7 @@
           <w14:ligatures w14:val="standardContextual"/>
         </w:rPr>
       </w:pPr>
-      <w:hyperlink w:anchor="_Toc228343032" w:history="1">
+      <w:hyperlink w:anchor="_Toc228775571" w:history="1">
         <w:r>
           <w:rPr>
             <w:rStyle w:val="Hyperlink"/>
@@ -4772,7 +4772,7 @@
             <w:noProof/>
             <w:webHidden/>
           </w:rPr>
-          <w:instrText xml:space="preserve"> PAGEREF _Toc228343032 \h </w:instrText>
+          <w:instrText xml:space="preserve"> PAGEREF _Toc228775571 \h </w:instrText>
         </w:r>
         <w:r>
           <w:rPr>
@@ -4819,7 +4819,7 @@
           <w14:ligatures w14:val="standardContextual"/>
         </w:rPr>
       </w:pPr>
-      <w:hyperlink w:anchor="_Toc228343033" w:history="1">
+      <w:hyperlink w:anchor="_Toc228775572" w:history="1">
         <w:r>
           <w:rPr>
             <w:rStyle w:val="Hyperlink"/>
@@ -4846,7 +4846,7 @@
             <w:noProof/>
             <w:webHidden/>
           </w:rPr>
-          <w:instrText xml:space="preserve"> PAGEREF _Toc228343033 \h </w:instrText>
+          <w:instrText xml:space="preserve"> PAGEREF _Toc228775572 \h </w:instrText>
         </w:r>
         <w:r>
           <w:rPr>
@@ -4893,7 +4893,7 @@
           <w14:ligatures w14:val="standardContextual"/>
         </w:rPr>
       </w:pPr>
-      <w:hyperlink w:anchor="_Toc228343034" w:history="1">
+      <w:hyperlink w:anchor="_Toc228775573" w:history="1">
         <w:r>
           <w:rPr>
             <w:rStyle w:val="Hyperlink"/>
@@ -4920,7 +4920,7 @@
             <w:noProof/>
             <w:webHidden/>
           </w:rPr>
-          <w:instrText xml:space="preserve"> PAGEREF _Toc228343034 \h </w:instrText>
+          <w:instrText xml:space="preserve"> PAGEREF _Toc228775573 \h </w:instrText>
         </w:r>
         <w:r>
           <w:rPr>
@@ -4966,8 +4966,8 @@
       <w:pPr>
         <w:pStyle w:val="Heading2"/>
       </w:pPr>
-      <w:bookmarkStart w:id="16" w:name="_Toc228342982"/>
-      <w:bookmarkStart w:id="17" w:name="_Toc228343016"/>
+      <w:bookmarkStart w:id="16" w:name="_Toc228775521"/>
+      <w:bookmarkStart w:id="17" w:name="_Toc228775555"/>
       <w:r>
         <w:t>1. Purpose</w:t>
       </w:r>
@@ -4991,8 +4991,8 @@
       <w:pPr>
         <w:pStyle w:val="Heading2"/>
       </w:pPr>
-      <w:bookmarkStart w:id="18" w:name="_Toc228342983"/>
-      <w:bookmarkStart w:id="19" w:name="_Toc228343017"/>
+      <w:bookmarkStart w:id="18" w:name="_Toc228775522"/>
+      <w:bookmarkStart w:id="19" w:name="_Toc228775556"/>
       <w:r>
         <w:t>2. Scope</w:t>
       </w:r>
@@ -5016,8 +5016,8 @@
       <w:pPr>
         <w:pStyle w:val="Heading2"/>
       </w:pPr>
-      <w:bookmarkStart w:id="20" w:name="_Toc228342984"/>
-      <w:bookmarkStart w:id="21" w:name="_Toc228343018"/>
+      <w:bookmarkStart w:id="20" w:name="_Toc228775523"/>
+      <w:bookmarkStart w:id="21" w:name="_Toc228775557"/>
       <w:r>
         <w:t>3. Prerequisites</w:t>
       </w:r>
@@ -5029,8 +5029,8 @@
       <w:pPr>
         <w:pStyle w:val="Heading3"/>
       </w:pPr>
-      <w:bookmarkStart w:id="22" w:name="_Toc228342985"/>
-      <w:bookmarkStart w:id="23" w:name="_Toc228343019"/>
+      <w:bookmarkStart w:id="22" w:name="_Toc228775524"/>
+      <w:bookmarkStart w:id="23" w:name="_Toc228775558"/>
       <w:r>
         <w:t>3.1 Runtime and Access</w:t>
       </w:r>
@@ -5238,8 +5238,8 @@
       <w:pPr>
         <w:pStyle w:val="Heading3"/>
       </w:pPr>
-      <w:bookmarkStart w:id="24" w:name="_Toc228342986"/>
-      <w:bookmarkStart w:id="25" w:name="_Toc228343020"/>
+      <w:bookmarkStart w:id="24" w:name="_Toc228775525"/>
+      <w:bookmarkStart w:id="25" w:name="_Toc228775559"/>
       <w:r>
         <w:t>3.2 Data dependencies</w:t>
       </w:r>
@@ -5298,8 +5298,8 @@
       <w:pPr>
         <w:pStyle w:val="Heading2"/>
       </w:pPr>
-      <w:bookmarkStart w:id="26" w:name="_Toc228342987"/>
-      <w:bookmarkStart w:id="27" w:name="_Toc228343021"/>
+      <w:bookmarkStart w:id="26" w:name="_Toc228775526"/>
+      <w:bookmarkStart w:id="27" w:name="_Toc228775560"/>
       <w:r>
         <w:t>4. Process Components</w:t>
       </w:r>
@@ -5378,7 +5378,7 @@
           </w:tcPr>
           <w:p>
             <w:r>
-              <w:t>`notebooks/I&amp;W Reporting/Batch/I&amp;W Spreadsheet/I&amp;W_Spreadsheet.py`</w:t>
+              <w:t>`I&amp;W Reporting/Batch/I&amp;W Spreadsheet/I&amp;W_Spreadsheet.py`</w:t>
             </w:r>
           </w:p>
         </w:tc>
@@ -5388,10 +5388,10 @@
           </w:tcPr>
           <w:p>
             <w:r>
-              <w:t xml:space="preserve">Pulls candidate </w:t>
-            </w:r>
-            <w:r>
-              <w:t>indicators and writes full spreadsheet for report generation</w:t>
+              <w:t xml:space="preserve">Pulls candidate indicators and writes </w:t>
+            </w:r>
+            <w:r>
+              <w:t>full spreadsheet for report generation</w:t>
             </w:r>
           </w:p>
         </w:tc>
@@ -5417,7 +5417,7 @@
           </w:tcPr>
           <w:p>
             <w:r>
-              <w:t>`notebooks/I&amp;W Reporting/Batch/I&amp;W Generator/I&amp;W_Generator.py`</w:t>
+              <w:t>`I&amp;W Reporting/Batch/I&amp;W Generator/I&amp;W_Generator.py`</w:t>
             </w:r>
           </w:p>
         </w:tc>
@@ -5452,7 +5452,7 @@
           </w:tcPr>
           <w:p>
             <w:r>
-              <w:t>`notebooks/I&amp;W Reporting/Batch/I&amp;W Expanded/I&amp;W_Document_expanded_spreadsheet.py`</w:t>
+              <w:t>`I&amp;W Reporting/Batch/I&amp;W Expanded/I&amp;W_Document_expanded_spreadsheet.py`</w:t>
             </w:r>
           </w:p>
         </w:tc>
@@ -5487,7 +5487,7 @@
           </w:tcPr>
           <w:p>
             <w:r>
-              <w:t>`notebooks/I&amp;W Reporting/Batch/I&amp;W Expanded/I&amp;W_Document_expanded_generator.py`</w:t>
+              <w:t>`I&amp;W Reporting/Batch/I&amp;W Expanded/I&amp;W_Document_expanded_generator.py`</w:t>
             </w:r>
           </w:p>
         </w:tc>
@@ -5549,8 +5549,8 @@
       <w:pPr>
         <w:pStyle w:val="Heading2"/>
       </w:pPr>
-      <w:bookmarkStart w:id="28" w:name="_Toc228342988"/>
-      <w:bookmarkStart w:id="29" w:name="_Toc228343022"/>
+      <w:bookmarkStart w:id="28" w:name="_Toc228775527"/>
+      <w:bookmarkStart w:id="29" w:name="_Toc228775561"/>
       <w:r>
         <w:t>5. Required Execution Order</w:t>
       </w:r>
@@ -5560,10 +5560,7 @@
     <w:p/>
     <w:p>
       <w:r>
-        <w:t xml:space="preserve">Run </w:t>
-      </w:r>
-      <w:r>
-        <w:t>in this order for complete daily processing:</w:t>
+        <w:t>Run in this order for complete daily processing:</w:t>
       </w:r>
     </w:p>
     <w:p/>
@@ -5621,8 +5618,8 @@
       <w:pPr>
         <w:pStyle w:val="Heading2"/>
       </w:pPr>
-      <w:bookmarkStart w:id="30" w:name="_Toc228342989"/>
-      <w:bookmarkStart w:id="31" w:name="_Toc228343023"/>
+      <w:bookmarkStart w:id="30" w:name="_Toc228775528"/>
+      <w:bookmarkStart w:id="31" w:name="_Toc228775562"/>
       <w:r>
         <w:t>6. Core Path Behavior</w:t>
       </w:r>
@@ -5634,8 +5631,8 @@
       <w:pPr>
         <w:pStyle w:val="Heading3"/>
       </w:pPr>
-      <w:bookmarkStart w:id="32" w:name="_Toc228342990"/>
-      <w:bookmarkStart w:id="33" w:name="_Toc228343024"/>
+      <w:bookmarkStart w:id="32" w:name="_Toc228775529"/>
+      <w:bookmarkStart w:id="33" w:name="_Toc228775563"/>
       <w:r>
         <w:t xml:space="preserve">6.1 </w:t>
       </w:r>
@@ -5738,7 +5735,17 @@
           <w:sz w:val="18"/>
           <w:u w:val="single"/>
         </w:rPr>
-        <w:t>Z:\HTOC\HTOC Reports\I&amp;W Reports\5. I&amp;W Staging\Spreadsheet\I&amp;W_indicators_full_{YYYYMMDD}.xlsx</w:t>
+        <w:t xml:space="preserve">Z:\HTOC\HTOC Reports\I&amp;W Reports\5. I&amp;W </w:t>
+      </w:r>
+      <w:r>
+        <w:rPr>
+          <w:rFonts w:ascii="Consolas" w:hAnsi="Consolas"/>
+          <w:b/>
+          <w:color w:val="003366"/>
+          <w:sz w:val="18"/>
+          <w:u w:val="single"/>
+        </w:rPr>
+        <w:t>Staging\Spreadsheet\I&amp;W_indicators_full_{YYYYMMDD}.xlsx</w:t>
       </w:r>
       <w:r>
         <w:t>.</w:t>
@@ -5749,8 +5756,8 @@
       <w:pPr>
         <w:pStyle w:val="Heading3"/>
       </w:pPr>
-      <w:bookmarkStart w:id="34" w:name="_Toc228342991"/>
-      <w:bookmarkStart w:id="35" w:name="_Toc228343025"/>
+      <w:bookmarkStart w:id="34" w:name="_Toc228775530"/>
+      <w:bookmarkStart w:id="35" w:name="_Toc228775564"/>
       <w:r>
         <w:t xml:space="preserve">6.2 </w:t>
       </w:r>
@@ -5869,8 +5876,8 @@
       <w:pPr>
         <w:pStyle w:val="Heading2"/>
       </w:pPr>
-      <w:bookmarkStart w:id="36" w:name="_Toc228342992"/>
-      <w:bookmarkStart w:id="37" w:name="_Toc228343026"/>
+      <w:bookmarkStart w:id="36" w:name="_Toc228775531"/>
+      <w:bookmarkStart w:id="37" w:name="_Toc228775565"/>
       <w:r>
         <w:t>7. Expanded Path Behavior</w:t>
       </w:r>
@@ -5882,8 +5889,8 @@
       <w:pPr>
         <w:pStyle w:val="Heading3"/>
       </w:pPr>
-      <w:bookmarkStart w:id="38" w:name="_Toc228342993"/>
-      <w:bookmarkStart w:id="39" w:name="_Toc228343027"/>
+      <w:bookmarkStart w:id="38" w:name="_Toc228775532"/>
+      <w:bookmarkStart w:id="39" w:name="_Toc228775566"/>
       <w:r>
         <w:t xml:space="preserve">7.1 </w:t>
       </w:r>
@@ -5959,8 +5966,8 @@
       <w:pPr>
         <w:pStyle w:val="Heading3"/>
       </w:pPr>
-      <w:bookmarkStart w:id="40" w:name="_Toc228342994"/>
-      <w:bookmarkStart w:id="41" w:name="_Toc228343028"/>
+      <w:bookmarkStart w:id="40" w:name="_Toc228775533"/>
+      <w:bookmarkStart w:id="41" w:name="_Toc228775567"/>
       <w:r>
         <w:t xml:space="preserve">7.2 </w:t>
       </w:r>
@@ -6020,17 +6027,7 @@
           <w:sz w:val="18"/>
           <w:u w:val="single"/>
         </w:rPr>
-        <w:t xml:space="preserve">Z:\HTOC\HTOC Reports\I&amp;W Reports\5. I&amp;W Staging\Expanded </w:t>
-      </w:r>
-      <w:r>
-        <w:rPr>
-          <w:rFonts w:ascii="Consolas" w:hAnsi="Consolas"/>
-          <w:b/>
-          <w:color w:val="003366"/>
-          <w:sz w:val="18"/>
-          <w:u w:val="single"/>
-        </w:rPr>
-        <w:t>Reports\{YYYY-MM-DD}\</w:t>
+        <w:t>Z:\HTOC\HTOC Reports\I&amp;W Reports\5. I&amp;W Staging\Expanded Reports\{YYYY-MM-DD}\</w:t>
       </w:r>
       <w:r>
         <w:t>.</w:t>
@@ -6070,8 +6067,8 @@
       <w:pPr>
         <w:pStyle w:val="Heading2"/>
       </w:pPr>
-      <w:bookmarkStart w:id="42" w:name="_Toc228342995"/>
-      <w:bookmarkStart w:id="43" w:name="_Toc228343029"/>
+      <w:bookmarkStart w:id="42" w:name="_Toc228775534"/>
+      <w:bookmarkStart w:id="43" w:name="_Toc228775568"/>
       <w:r>
         <w:lastRenderedPageBreak/>
         <w:t>8. Batch Launcher Behavior</w:t>
@@ -6136,16 +6133,16 @@
     </w:p>
     <w:p>
       <w:r>
-        <w:t xml:space="preserve">Return </w:t>
-      </w:r>
-      <w:r>
-        <w:t>non-zero exit code on failure.</w:t>
+        <w:t>Return non-zero exit code on failure.</w:t>
       </w:r>
     </w:p>
     <w:p/>
     <w:p>
       <w:r>
-        <w:t>The hardened launchers (</w:t>
+        <w:t xml:space="preserve">The hardened </w:t>
+      </w:r>
+      <w:r>
+        <w:t>launchers (</w:t>
       </w:r>
       <w:r>
         <w:rPr>
@@ -6221,8 +6218,8 @@
       <w:pPr>
         <w:pStyle w:val="Heading2"/>
       </w:pPr>
-      <w:bookmarkStart w:id="44" w:name="_Toc228342996"/>
-      <w:bookmarkStart w:id="45" w:name="_Toc228343030"/>
+      <w:bookmarkStart w:id="44" w:name="_Toc228775535"/>
+      <w:bookmarkStart w:id="45" w:name="_Toc228775569"/>
       <w:r>
         <w:t>9. Run Success Criteria</w:t>
       </w:r>
@@ -6353,8 +6350,8 @@
       <w:pPr>
         <w:pStyle w:val="Heading2"/>
       </w:pPr>
-      <w:bookmarkStart w:id="46" w:name="_Toc228342997"/>
-      <w:bookmarkStart w:id="47" w:name="_Toc228343031"/>
+      <w:bookmarkStart w:id="46" w:name="_Toc228775536"/>
+      <w:bookmarkStart w:id="47" w:name="_Toc228775570"/>
       <w:r>
         <w:t>10. Troubleshooting</w:t>
       </w:r>
@@ -6458,7 +6455,10 @@
           </w:tcPr>
           <w:p>
             <w:r>
-              <w:t>`Failed to load configuration`</w:t>
+              <w:t xml:space="preserve">`Failed to </w:t>
+            </w:r>
+            <w:r>
+              <w:t>load configuration`</w:t>
             </w:r>
           </w:p>
         </w:tc>
@@ -6493,10 +6493,7 @@
           </w:tcPr>
           <w:p>
             <w:r>
-              <w:t xml:space="preserve">`No indicators </w:t>
-            </w:r>
-            <w:r>
-              <w:t>retrieved` or `No data to export`</w:t>
+              <w:t>`No indicators retrieved` or `No data to export`</w:t>
             </w:r>
           </w:p>
         </w:tc>
@@ -6611,7 +6608,10 @@
           </w:tcPr>
           <w:p>
             <w:r>
-              <w:t>All candidates already in `indicators.csv`</w:t>
+              <w:t xml:space="preserve">All candidates already in </w:t>
+            </w:r>
+            <w:r>
+              <w:t>`indicators.csv`</w:t>
             </w:r>
           </w:p>
         </w:tc>
@@ -6638,8 +6638,8 @@
       <w:pPr>
         <w:pStyle w:val="Heading2"/>
       </w:pPr>
-      <w:bookmarkStart w:id="48" w:name="_Toc228342998"/>
-      <w:bookmarkStart w:id="49" w:name="_Toc228343032"/>
+      <w:bookmarkStart w:id="48" w:name="_Toc228775537"/>
+      <w:bookmarkStart w:id="49" w:name="_Toc228775571"/>
       <w:r>
         <w:t>11. Operator Decision Points</w:t>
       </w:r>
@@ -6649,15 +6649,15 @@
     <w:p/>
     <w:p>
       <w:r>
-        <w:t xml:space="preserve">If core spreadsheet is empty, confirm whether this is an expected low-activity day </w:t>
-      </w:r>
-      <w:r>
-        <w:t>before escalation.</w:t>
-      </w:r>
-    </w:p>
-    <w:p>
-      <w:r>
-        <w:t>If enrichment partially fails but critical outputs exist, decide whether to publish with reduced context or rerun.</w:t>
+        <w:t>If core spreadsheet is empty, confirm whether this is an expected low-activity day before escalation.</w:t>
+      </w:r>
+    </w:p>
+    <w:p>
+      <w:r>
+        <w:t xml:space="preserve">If enrichment partially fails but </w:t>
+      </w:r>
+      <w:r>
+        <w:t>critical outputs exist, decide whether to publish with reduced context or rerun.</w:t>
       </w:r>
     </w:p>
     <w:p>
@@ -6681,8 +6681,8 @@
       <w:pPr>
         <w:pStyle w:val="Heading2"/>
       </w:pPr>
-      <w:bookmarkStart w:id="50" w:name="_Toc228342999"/>
-      <w:bookmarkStart w:id="51" w:name="_Toc228343033"/>
+      <w:bookmarkStart w:id="50" w:name="_Toc228775538"/>
+      <w:bookmarkStart w:id="51" w:name="_Toc228775572"/>
       <w:r>
         <w:t>12. How to Run Manually</w:t>
       </w:r>
@@ -6798,8 +6798,8 @@
       <w:pPr>
         <w:pStyle w:val="Heading2"/>
       </w:pPr>
-      <w:bookmarkStart w:id="52" w:name="_Toc228343000"/>
-      <w:bookmarkStart w:id="53" w:name="_Toc228343034"/>
+      <w:bookmarkStart w:id="52" w:name="_Toc228775539"/>
+      <w:bookmarkStart w:id="53" w:name="_Toc228775573"/>
       <w:r>
         <w:t>13. Related Documents</w:t>
       </w:r>
@@ -6991,7 +6991,7 @@
               <w:noProof/>
             </w:rPr>
             <w:drawing>
-              <wp:inline distT="0" distB="0" distL="0" distR="0" wp14:anchorId="23B2F4BA" wp14:editId="23634C1A">
+              <wp:inline distT="0" distB="0" distL="0" distR="0" wp14:anchorId="7B9F4C40" wp14:editId="293D3F5E">
                 <wp:extent cx="957532" cy="444240"/>
                 <wp:effectExtent l="0" t="0" r="0" b="0"/>
                 <wp:docPr id="1601952155" name="Picture 1601952155"/>
@@ -7320,7 +7320,7 @@
               <w:noProof/>
             </w:rPr>
             <w:drawing>
-              <wp:inline distT="0" distB="0" distL="0" distR="0" wp14:anchorId="1DE0B428" wp14:editId="506C1EB3">
+              <wp:inline distT="0" distB="0" distL="0" distR="0" wp14:anchorId="4A59873D" wp14:editId="67A611EA">
                 <wp:extent cx="1524000" cy="482851"/>
                 <wp:effectExtent l="0" t="0" r="0" b="0"/>
                 <wp:docPr id="402729602" name="Picture 1"/>
@@ -7377,7 +7377,7 @@
       <mc:AlternateContent>
         <mc:Choice Requires="wps">
           <w:drawing>
-            <wp:anchor distT="0" distB="0" distL="114300" distR="114300" simplePos="0" relativeHeight="251658240" behindDoc="0" locked="0" layoutInCell="1" allowOverlap="1" wp14:anchorId="5EE28D65" wp14:editId="345749C3">
+            <wp:anchor distT="0" distB="0" distL="114300" distR="114300" simplePos="0" relativeHeight="251658240" behindDoc="0" locked="0" layoutInCell="1" allowOverlap="1" wp14:anchorId="690A2748" wp14:editId="4591D6DD">
               <wp:simplePos x="0" y="0"/>
               <wp:positionH relativeFrom="column">
                 <wp:posOffset>-946150</wp:posOffset>
@@ -7455,7 +7455,7 @@
         <w:szCs w:val="22"/>
       </w:rPr>
       <w:drawing>
-        <wp:anchor distT="0" distB="0" distL="114300" distR="114300" simplePos="0" relativeHeight="251661312" behindDoc="0" locked="0" layoutInCell="1" allowOverlap="1" wp14:anchorId="13B5912A" wp14:editId="378EAB23">
+        <wp:anchor distT="0" distB="0" distL="114300" distR="114300" simplePos="0" relativeHeight="251661312" behindDoc="0" locked="0" layoutInCell="1" allowOverlap="1" wp14:anchorId="06ECB0BC" wp14:editId="4144C49C">
           <wp:simplePos x="0" y="0"/>
           <wp:positionH relativeFrom="column">
             <wp:posOffset>9591675</wp:posOffset>
@@ -7537,7 +7537,7 @@
       <mc:AlternateContent>
         <mc:Choice Requires="wps">
           <w:drawing>
-            <wp:anchor distT="0" distB="0" distL="114300" distR="114300" simplePos="0" relativeHeight="251662336" behindDoc="0" locked="0" layoutInCell="1" allowOverlap="1" wp14:anchorId="77481E00" wp14:editId="24B3E05C">
+            <wp:anchor distT="0" distB="0" distL="114300" distR="114300" simplePos="0" relativeHeight="251662336" behindDoc="0" locked="0" layoutInCell="1" allowOverlap="1" wp14:anchorId="063763E0" wp14:editId="15FF3BA1">
               <wp:simplePos x="0" y="0"/>
               <wp:positionH relativeFrom="column">
                 <wp:posOffset>8305800</wp:posOffset>
@@ -12186,30 +12186,10 @@
 </file>
 
 <file path=customXml/item1.xml><?xml version="1.0" encoding="utf-8"?>
-<?mso-contentType ?>
-<FormTemplates xmlns="http://schemas.microsoft.com/sharepoint/v3/contenttype/forms">
-  <Display>DocumentLibraryForm</Display>
-  <Edit>DocumentLibraryForm</Edit>
-  <New>DocumentLibraryForm</New>
-</FormTemplates>
+<b:Sources xmlns:b="http://schemas.openxmlformats.org/officeDocument/2006/bibliography" xmlns="http://schemas.openxmlformats.org/officeDocument/2006/bibliography" SelectedStyle="/APASixthEditionOfficeOnline.xsl" StyleName="APA" Version="6"/>
 </file>
 
 <file path=customXml/item2.xml><?xml version="1.0" encoding="utf-8"?>
-<p:properties xmlns:p="http://schemas.microsoft.com/office/2006/metadata/properties" xmlns:xsi="http://www.w3.org/2001/XMLSchema-instance" xmlns:pc="http://schemas.microsoft.com/office/infopath/2007/PartnerControls">
-  <documentManagement>
-    <lcf76f155ced4ddcb4097134ff3c332f xmlns="afb72fb5-58d3-46e0-8b83-6204a9ccb897">
-      <Terms xmlns="http://schemas.microsoft.com/office/infopath/2007/PartnerControls"/>
-    </lcf76f155ced4ddcb4097134ff3c332f>
-    <TaxCatchAll xmlns="7eeb797a-e46d-47e3-9f8b-1124477eb690" xsi:nil="true"/>
-  </documentManagement>
-</p:properties>
-</file>
-
-<file path=customXml/item3.xml><?xml version="1.0" encoding="utf-8"?>
-<b:Sources xmlns:b="http://schemas.openxmlformats.org/officeDocument/2006/bibliography" xmlns="http://schemas.openxmlformats.org/officeDocument/2006/bibliography" SelectedStyle="/APASixthEditionOfficeOnline.xsl" StyleName="APA" Version="6"/>
-</file>
-
-<file path=customXml/item4.xml><?xml version="1.0" encoding="utf-8"?>
 <ct:contentTypeSchema xmlns:ct="http://schemas.microsoft.com/office/2006/metadata/contentType" xmlns:ma="http://schemas.microsoft.com/office/2006/metadata/properties/metaAttributes" ct:_="" ma:_="" ma:contentTypeName="Document" ma:contentTypeID="0x010100AFCF4B2913B96A488E0F743192725261" ma:contentTypeVersion="10" ma:contentTypeDescription="Create a new document." ma:contentTypeScope="" ma:versionID="2a3907d622944450d873795b62bd3fd1">
   <xsd:schema xmlns:xsd="http://www.w3.org/2001/XMLSchema" xmlns:xs="http://www.w3.org/2001/XMLSchema" xmlns:p="http://schemas.microsoft.com/office/2006/metadata/properties" xmlns:ns2="afb72fb5-58d3-46e0-8b83-6204a9ccb897" xmlns:ns3="7eeb797a-e46d-47e3-9f8b-1124477eb690" targetNamespace="http://schemas.microsoft.com/office/2006/metadata/properties" ma:root="true" ma:fieldsID="95604d8cadeb01aab63de2737106632d" ns2:_="" ns3:_="">
     <xsd:import namespace="afb72fb5-58d3-46e0-8b83-6204a9ccb897"/>
@@ -12398,26 +12378,27 @@
 </ct:contentTypeSchema>
 </file>
 
-<file path=customXml/itemProps1.xml><?xml version="1.0" encoding="utf-8"?>
-<ds:datastoreItem xmlns:ds="http://schemas.openxmlformats.org/officeDocument/2006/customXml" ds:itemID="{4C9DE648-81B7-4867-9DBA-8D42A681444E}">
-  <ds:schemaRefs>
-    <ds:schemaRef ds:uri="http://schemas.microsoft.com/sharepoint/v3/contenttype/forms"/>
-  </ds:schemaRefs>
-</ds:datastoreItem>
+<file path=customXml/item3.xml><?xml version="1.0" encoding="utf-8"?>
+<?mso-contentType ?>
+<FormTemplates xmlns="http://schemas.microsoft.com/sharepoint/v3/contenttype/forms">
+  <Display>DocumentLibraryForm</Display>
+  <Edit>DocumentLibraryForm</Edit>
+  <New>DocumentLibraryForm</New>
+</FormTemplates>
 </file>
 
-<file path=customXml/itemProps2.xml><?xml version="1.0" encoding="utf-8"?>
-<ds:datastoreItem xmlns:ds="http://schemas.openxmlformats.org/officeDocument/2006/customXml" ds:itemID="{9B00A5AB-C3F4-4CD2-AAC1-F40B6DF48AEE}">
-  <ds:schemaRefs>
-    <ds:schemaRef ds:uri="http://schemas.microsoft.com/office/2006/metadata/properties"/>
-    <ds:schemaRef ds:uri="http://schemas.microsoft.com/office/infopath/2007/PartnerControls"/>
-    <ds:schemaRef ds:uri="afb72fb5-58d3-46e0-8b83-6204a9ccb897"/>
-    <ds:schemaRef ds:uri="7eeb797a-e46d-47e3-9f8b-1124477eb690"/>
-  </ds:schemaRefs>
-</ds:datastoreItem>
+<file path=customXml/item4.xml><?xml version="1.0" encoding="utf-8"?>
+<p:properties xmlns:p="http://schemas.microsoft.com/office/2006/metadata/properties" xmlns:xsi="http://www.w3.org/2001/XMLSchema-instance" xmlns:pc="http://schemas.microsoft.com/office/infopath/2007/PartnerControls">
+  <documentManagement>
+    <lcf76f155ced4ddcb4097134ff3c332f xmlns="afb72fb5-58d3-46e0-8b83-6204a9ccb897">
+      <Terms xmlns="http://schemas.microsoft.com/office/infopath/2007/PartnerControls"/>
+    </lcf76f155ced4ddcb4097134ff3c332f>
+    <TaxCatchAll xmlns="7eeb797a-e46d-47e3-9f8b-1124477eb690" xsi:nil="true"/>
+  </documentManagement>
+</p:properties>
 </file>
 
-<file path=customXml/itemProps3.xml><?xml version="1.0" encoding="utf-8"?>
+<file path=customXml/itemProps1.xml><?xml version="1.0" encoding="utf-8"?>
 <ds:datastoreItem xmlns:ds="http://schemas.openxmlformats.org/officeDocument/2006/customXml" ds:itemID="{019324B5-EF86-1D45-B65C-69FFDDC5F259}">
   <ds:schemaRefs>
     <ds:schemaRef ds:uri="http://schemas.openxmlformats.org/officeDocument/2006/bibliography"/>
@@ -12425,7 +12406,7 @@
 </ds:datastoreItem>
 </file>
 
-<file path=customXml/itemProps4.xml><?xml version="1.0" encoding="utf-8"?>
+<file path=customXml/itemProps2.xml><?xml version="1.0" encoding="utf-8"?>
 <ds:datastoreItem xmlns:ds="http://schemas.openxmlformats.org/officeDocument/2006/customXml" ds:itemID="{3BB6F7E9-CC77-46A3-8137-2A102AA86487}">
   <ds:schemaRefs>
     <ds:schemaRef ds:uri="http://schemas.microsoft.com/office/2006/metadata/contentType"/>
@@ -12444,6 +12425,25 @@
 </ds:datastoreItem>
 </file>
 
+<file path=customXml/itemProps3.xml><?xml version="1.0" encoding="utf-8"?>
+<ds:datastoreItem xmlns:ds="http://schemas.openxmlformats.org/officeDocument/2006/customXml" ds:itemID="{4C9DE648-81B7-4867-9DBA-8D42A681444E}">
+  <ds:schemaRefs>
+    <ds:schemaRef ds:uri="http://schemas.microsoft.com/sharepoint/v3/contenttype/forms"/>
+  </ds:schemaRefs>
+</ds:datastoreItem>
+</file>
+
+<file path=customXml/itemProps4.xml><?xml version="1.0" encoding="utf-8"?>
+<ds:datastoreItem xmlns:ds="http://schemas.openxmlformats.org/officeDocument/2006/customXml" ds:itemID="{9B00A5AB-C3F4-4CD2-AAC1-F40B6DF48AEE}">
+  <ds:schemaRefs>
+    <ds:schemaRef ds:uri="http://schemas.microsoft.com/office/2006/metadata/properties"/>
+    <ds:schemaRef ds:uri="http://schemas.microsoft.com/office/infopath/2007/PartnerControls"/>
+    <ds:schemaRef ds:uri="afb72fb5-58d3-46e0-8b83-6204a9ccb897"/>
+    <ds:schemaRef ds:uri="7eeb797a-e46d-47e3-9f8b-1124477eb690"/>
+  </ds:schemaRefs>
+</ds:datastoreItem>
+</file>
+
 <file path=docMetadata/LabelInfo.xml><?xml version="1.0" encoding="utf-8"?>
 <clbl:labelList xmlns:clbl="http://schemas.microsoft.com/office/2020/mipLabelMetadata">
   <clbl:label id="{d58addea-5053-4a80-8499-ba4d944910df}" enabled="0" method="" siteId="{d58addea-5053-4a80-8499-ba4d944910df}" removed="1"/>

</xml_diff>